<commit_message>
v2.1.0: Fix recipe persistence + UI improvements - Create product_recipes table with permissive RLS - Replace IconButton with labeled FilledButton on Produk, Bahan Baku, Pembelian - Add Supplier management (form, list, navigation, purchase integration) - Add recipe providers and repository - Add deploy workflow
</commit_message>
<xml_diff>
--- a/APLIKASI JUAL BELI LF KITCHEN.docx
+++ b/APLIKASI JUAL BELI LF KITCHEN.docx
@@ -50,6 +50,7 @@
           <w:bCs/>
         </w:rPr>
       </w:pPr>
+      <w:proofErr w:type="gramStart"/>
       <w:r>
         <w:rPr>
           <w:b/>
@@ -57,6 +58,7 @@
         </w:rPr>
         <w:t>PROMPT :</w:t>
       </w:r>
+      <w:proofErr w:type="gramEnd"/>
     </w:p>
     <w:p>
       <w:pPr>
@@ -270,9 +272,11 @@
       </w:r>
     </w:p>
     <w:p>
+      <w:proofErr w:type="gramStart"/>
       <w:r>
         <w:t>CONTOH :</w:t>
       </w:r>
+      <w:proofErr w:type="gramEnd"/>
     </w:p>
     <w:p>
       <w:pPr>
@@ -357,7 +361,15 @@
       </w:r>
       <w:proofErr w:type="spellEnd"/>
       <w:r>
-        <w:t xml:space="preserve"> (Dependency Injection) dan . Visual Warning (Tanda </w:t>
+        <w:t xml:space="preserve"> (Dependency Injection) </w:t>
+      </w:r>
+      <w:proofErr w:type="gramStart"/>
+      <w:r>
+        <w:t>dan .</w:t>
+      </w:r>
+      <w:proofErr w:type="gramEnd"/>
+      <w:r>
+        <w:t xml:space="preserve"> Visual Warning (Tanda </w:t>
       </w:r>
       <w:proofErr w:type="spellStart"/>
       <w:r>
@@ -398,21 +410,17 @@
       <w:pPr>
         <w:spacing w:after="0"/>
       </w:pPr>
+      <w:proofErr w:type="gramStart"/>
       <w:r>
         <w:t>CONTOH :</w:t>
       </w:r>
+      <w:proofErr w:type="gramEnd"/>
     </w:p>
     <w:p>
       <w:pPr>
         <w:spacing w:after="0"/>
-        <w:rPr>
-          <w:lang w:val="sv-SE"/>
-        </w:rPr>
-      </w:pPr>
-      <w:r>
-        <w:rPr>
-          <w:lang w:val="sv-SE"/>
-        </w:rPr>
+      </w:pPr>
+      <w:r>
         <w:t>SCAN KESELURUH APP DAN BUAT PLAN YANG DIBUTUHKAN UNTUK API BACKEND DAN SKEMA DATABASENYA</w:t>
       </w:r>
     </w:p>
@@ -1563,8 +1571,17 @@
           <w:b/>
           <w:bCs/>
         </w:rPr>
-        <w:t>Nama Pemesan</w:t>
-      </w:r>
+        <w:t xml:space="preserve">Nama </w:t>
+      </w:r>
+      <w:proofErr w:type="spellStart"/>
+      <w:r>
+        <w:rPr>
+          <w:b/>
+          <w:bCs/>
+        </w:rPr>
+        <w:t>Pemesan</w:t>
+      </w:r>
+      <w:proofErr w:type="spellEnd"/>
       <w:r>
         <w:t>.</w:t>
       </w:r>
@@ -1905,7 +1922,7 @@
       </w:pPr>
       <w:r>
         <w:pict w14:anchorId="3861F9EB">
-          <v:rect id="_x0000_i1049" style="width:456pt;height:.75pt" o:hrpct="0" o:hralign="center" o:hrstd="t" o:hrnoshade="t" o:hr="t" fillcolor="#ccc" stroked="f"/>
+          <v:rect id="_x0000_i1025" style="width:456pt;height:.75pt" o:hrpct="0" o:hralign="center" o:hrstd="t" o:hrnoshade="t" o:hr="t" fillcolor="#ccc" stroked="f"/>
         </w:pict>
       </w:r>
     </w:p>
@@ -2676,7 +2693,7 @@
       </w:pPr>
       <w:r>
         <w:pict w14:anchorId="21BD7162">
-          <v:rect id="_x0000_i1050" style="width:456pt;height:.75pt" o:hrpct="0" o:hralign="center" o:hrstd="t" o:hrnoshade="t" o:hr="t" fillcolor="#ccc" stroked="f"/>
+          <v:rect id="_x0000_i1026" style="width:456pt;height:.75pt" o:hrpct="0" o:hralign="center" o:hrstd="t" o:hrnoshade="t" o:hr="t" fillcolor="#ccc" stroked="f"/>
         </w:pict>
       </w:r>
     </w:p>
@@ -3478,7 +3495,7 @@
       </w:pPr>
       <w:r>
         <w:pict w14:anchorId="7BB37B3D">
-          <v:rect id="_x0000_i1051" style="width:456pt;height:.75pt" o:hrpct="0" o:hralign="center" o:hrstd="t" o:hrnoshade="t" o:hr="t" fillcolor="#ccc" stroked="f"/>
+          <v:rect id="_x0000_i1027" style="width:456pt;height:.75pt" o:hrpct="0" o:hralign="center" o:hrstd="t" o:hrnoshade="t" o:hr="t" fillcolor="#ccc" stroked="f"/>
         </w:pict>
       </w:r>
     </w:p>
@@ -3644,7 +3661,7 @@
       </w:pPr>
       <w:r>
         <w:pict w14:anchorId="2F8BCDAB">
-          <v:rect id="_x0000_i1052" style="width:456pt;height:.75pt" o:hrpct="0" o:hralign="center" o:hrstd="t" o:hrnoshade="t" o:hr="t" fillcolor="#ccc" stroked="f"/>
+          <v:rect id="_x0000_i1028" style="width:456pt;height:.75pt" o:hrpct="0" o:hralign="center" o:hrstd="t" o:hrnoshade="t" o:hr="t" fillcolor="#ccc" stroked="f"/>
         </w:pict>
       </w:r>
     </w:p>
@@ -4059,21 +4076,28 @@
       </w:r>
       <w:proofErr w:type="spellEnd"/>
       <w:r>
-        <w:t xml:space="preserve"> App (Adaptive Shell)</w:t>
+        <w:t xml:space="preserve"> App (Adaptive </w:t>
+      </w:r>
+      <w:proofErr w:type="gramStart"/>
+      <w:r>
+        <w:t>Shell)</w:t>
       </w:r>
       <w:proofErr w:type="spellStart"/>
       <w:r>
         <w:t>AuthNoYesSplash</w:t>
       </w:r>
       <w:proofErr w:type="spellEnd"/>
+      <w:proofErr w:type="gramEnd"/>
       <w:r>
         <w:t xml:space="preserve"> </w:t>
       </w:r>
       <w:proofErr w:type="spellStart"/>
+      <w:proofErr w:type="gramStart"/>
       <w:r>
         <w:t>ScreenLogin?Login</w:t>
       </w:r>
       <w:proofErr w:type="spellEnd"/>
+      <w:proofErr w:type="gramEnd"/>
       <w:r>
         <w:t xml:space="preserve"> </w:t>
       </w:r>
@@ -5484,6 +5508,977 @@
         </w:rPr>
       </w:pPr>
     </w:p>
+    <w:p>
+      <w:pPr>
+        <w:rPr>
+          <w:lang w:val="sv-SE"/>
+        </w:rPr>
+      </w:pPr>
+      <w:r>
+        <w:rPr>
+          <w:lang w:val="sv-SE"/>
+        </w:rPr>
+        <w:br w:type="page"/>
+      </w:r>
+    </w:p>
+    <w:p>
+      <w:pPr>
+        <w:pStyle w:val="ListParagraph"/>
+        <w:jc w:val="both"/>
+        <w:rPr>
+          <w:lang w:val="id-ID"/>
+        </w:rPr>
+      </w:pPr>
+      <w:r>
+        <w:rPr>
+          <w:lang w:val="id-ID"/>
+        </w:rPr>
+        <w:lastRenderedPageBreak/>
+        <w:t>Tentu! Proyek Anda sudah dikonfigurasi untuk menggunakan </w:t>
+      </w:r>
+      <w:proofErr w:type="spellStart"/>
+      <w:r>
+        <w:rPr>
+          <w:b/>
+          <w:bCs/>
+          <w:lang w:val="id-ID"/>
+        </w:rPr>
+        <w:t>Firebase</w:t>
+      </w:r>
+      <w:proofErr w:type="spellEnd"/>
+      <w:r>
+        <w:rPr>
+          <w:b/>
+          <w:bCs/>
+          <w:lang w:val="id-ID"/>
+        </w:rPr>
+        <w:t xml:space="preserve"> </w:t>
+      </w:r>
+      <w:proofErr w:type="spellStart"/>
+      <w:r>
+        <w:rPr>
+          <w:b/>
+          <w:bCs/>
+          <w:lang w:val="id-ID"/>
+        </w:rPr>
+        <w:t>Hosting</w:t>
+      </w:r>
+      <w:proofErr w:type="spellEnd"/>
+      <w:r>
+        <w:rPr>
+          <w:lang w:val="id-ID"/>
+        </w:rPr>
+        <w:t> dengan Project ID: </w:t>
+      </w:r>
+    </w:p>
+    <w:p>
+      <w:pPr>
+        <w:pStyle w:val="ListParagraph"/>
+        <w:jc w:val="both"/>
+        <w:rPr>
+          <w:lang w:val="id-ID"/>
+        </w:rPr>
+      </w:pPr>
+      <w:r>
+        <w:rPr>
+          <w:lang w:val="id-ID"/>
+        </w:rPr>
+        <w:t>lfkitchen-app-5070f</w:t>
+      </w:r>
+    </w:p>
+    <w:p>
+      <w:pPr>
+        <w:pStyle w:val="ListParagraph"/>
+        <w:jc w:val="both"/>
+        <w:rPr>
+          <w:lang w:val="id-ID"/>
+        </w:rPr>
+      </w:pPr>
+      <w:r>
+        <w:rPr>
+          <w:lang w:val="id-ID"/>
+        </w:rPr>
+        <w:t>.</w:t>
+      </w:r>
+    </w:p>
+    <w:p>
+      <w:pPr>
+        <w:pStyle w:val="ListParagraph"/>
+        <w:jc w:val="both"/>
+        <w:rPr>
+          <w:lang w:val="id-ID"/>
+        </w:rPr>
+      </w:pPr>
+      <w:r>
+        <w:rPr>
+          <w:lang w:val="id-ID"/>
+        </w:rPr>
+        <w:t xml:space="preserve">Berikut adalah langkah-langkah untuk melakukan </w:t>
+      </w:r>
+      <w:proofErr w:type="spellStart"/>
+      <w:r>
+        <w:rPr>
+          <w:lang w:val="id-ID"/>
+        </w:rPr>
+        <w:t>deploy</w:t>
+      </w:r>
+      <w:proofErr w:type="spellEnd"/>
+      <w:r>
+        <w:rPr>
+          <w:lang w:val="id-ID"/>
+        </w:rPr>
+        <w:t xml:space="preserve"> (saya juga sudah membuatkan </w:t>
+      </w:r>
+      <w:proofErr w:type="spellStart"/>
+      <w:r>
+        <w:rPr>
+          <w:lang w:val="id-ID"/>
+        </w:rPr>
+        <w:t>file</w:t>
+      </w:r>
+      <w:proofErr w:type="spellEnd"/>
+      <w:r>
+        <w:rPr>
+          <w:lang w:val="id-ID"/>
+        </w:rPr>
+        <w:t xml:space="preserve"> panduan di </w:t>
+      </w:r>
+    </w:p>
+    <w:p>
+      <w:pPr>
+        <w:pStyle w:val="ListParagraph"/>
+        <w:jc w:val="both"/>
+        <w:rPr>
+          <w:lang w:val="id-ID"/>
+        </w:rPr>
+      </w:pPr>
+      <w:r>
+        <w:rPr>
+          <w:lang w:val="id-ID"/>
+        </w:rPr>
+        <w:t>.</w:t>
+      </w:r>
+      <w:proofErr w:type="spellStart"/>
+      <w:r>
+        <w:rPr>
+          <w:lang w:val="id-ID"/>
+        </w:rPr>
+        <w:t>agent</w:t>
+      </w:r>
+      <w:proofErr w:type="spellEnd"/>
+      <w:r>
+        <w:rPr>
+          <w:lang w:val="id-ID"/>
+        </w:rPr>
+        <w:t>/</w:t>
+      </w:r>
+      <w:proofErr w:type="spellStart"/>
+      <w:r>
+        <w:rPr>
+          <w:lang w:val="id-ID"/>
+        </w:rPr>
+        <w:t>workflows</w:t>
+      </w:r>
+      <w:proofErr w:type="spellEnd"/>
+      <w:r>
+        <w:rPr>
+          <w:lang w:val="id-ID"/>
+        </w:rPr>
+        <w:t>/deploy.md):</w:t>
+      </w:r>
+    </w:p>
+    <w:p>
+      <w:pPr>
+        <w:pStyle w:val="ListParagraph"/>
+        <w:jc w:val="both"/>
+        <w:rPr>
+          <w:b/>
+          <w:bCs/>
+          <w:lang w:val="id-ID"/>
+        </w:rPr>
+      </w:pPr>
+      <w:r>
+        <w:rPr>
+          <w:b/>
+          <w:bCs/>
+          <w:lang w:val="id-ID"/>
+        </w:rPr>
+        <w:t xml:space="preserve">Langkah-langkah </w:t>
+      </w:r>
+      <w:proofErr w:type="spellStart"/>
+      <w:r>
+        <w:rPr>
+          <w:b/>
+          <w:bCs/>
+          <w:lang w:val="id-ID"/>
+        </w:rPr>
+        <w:t>Deploy</w:t>
+      </w:r>
+      <w:proofErr w:type="spellEnd"/>
+      <w:r>
+        <w:rPr>
+          <w:b/>
+          <w:bCs/>
+          <w:lang w:val="id-ID"/>
+        </w:rPr>
+        <w:t>:</w:t>
+      </w:r>
+    </w:p>
+    <w:p>
+      <w:pPr>
+        <w:pStyle w:val="ListParagraph"/>
+        <w:numPr>
+          <w:ilvl w:val="0"/>
+          <w:numId w:val="23"/>
+        </w:numPr>
+        <w:jc w:val="both"/>
+        <w:rPr>
+          <w:lang w:val="id-ID"/>
+        </w:rPr>
+      </w:pPr>
+      <w:proofErr w:type="spellStart"/>
+      <w:r>
+        <w:rPr>
+          <w:b/>
+          <w:bCs/>
+          <w:lang w:val="id-ID"/>
+        </w:rPr>
+        <w:t>Build</w:t>
+      </w:r>
+      <w:proofErr w:type="spellEnd"/>
+      <w:r>
+        <w:rPr>
+          <w:b/>
+          <w:bCs/>
+          <w:lang w:val="id-ID"/>
+        </w:rPr>
+        <w:t xml:space="preserve"> Aplikasi Web</w:t>
+      </w:r>
+      <w:r>
+        <w:rPr>
+          <w:lang w:val="id-ID"/>
+        </w:rPr>
+        <w:t xml:space="preserve">: Jalankan perintah ini di terminal untuk membuat </w:t>
+      </w:r>
+      <w:proofErr w:type="spellStart"/>
+      <w:r>
+        <w:rPr>
+          <w:lang w:val="id-ID"/>
+        </w:rPr>
+        <w:t>file</w:t>
+      </w:r>
+      <w:proofErr w:type="spellEnd"/>
+      <w:r>
+        <w:rPr>
+          <w:lang w:val="id-ID"/>
+        </w:rPr>
+        <w:t xml:space="preserve"> versi produksi:</w:t>
+      </w:r>
+    </w:p>
+    <w:p>
+      <w:pPr>
+        <w:pStyle w:val="ListParagraph"/>
+        <w:jc w:val="both"/>
+        <w:rPr>
+          <w:lang w:val="id-ID"/>
+        </w:rPr>
+      </w:pPr>
+      <w:proofErr w:type="spellStart"/>
+      <w:r>
+        <w:rPr>
+          <w:lang w:val="id-ID"/>
+        </w:rPr>
+        <w:t>powershell</w:t>
+      </w:r>
+      <w:proofErr w:type="spellEnd"/>
+    </w:p>
+    <w:p>
+      <w:pPr>
+        <w:pStyle w:val="ListParagraph"/>
+        <w:jc w:val="both"/>
+        <w:rPr>
+          <w:lang w:val="id-ID"/>
+        </w:rPr>
+      </w:pPr>
+      <w:proofErr w:type="spellStart"/>
+      <w:r>
+        <w:rPr>
+          <w:lang w:val="id-ID"/>
+        </w:rPr>
+        <w:t>flutter</w:t>
+      </w:r>
+      <w:proofErr w:type="spellEnd"/>
+      <w:r>
+        <w:rPr>
+          <w:lang w:val="id-ID"/>
+        </w:rPr>
+        <w:t xml:space="preserve"> </w:t>
+      </w:r>
+      <w:proofErr w:type="spellStart"/>
+      <w:r>
+        <w:rPr>
+          <w:lang w:val="id-ID"/>
+        </w:rPr>
+        <w:t>build</w:t>
+      </w:r>
+      <w:proofErr w:type="spellEnd"/>
+      <w:r>
+        <w:rPr>
+          <w:lang w:val="id-ID"/>
+        </w:rPr>
+        <w:t xml:space="preserve"> web --</w:t>
+      </w:r>
+      <w:proofErr w:type="spellStart"/>
+      <w:r>
+        <w:rPr>
+          <w:lang w:val="id-ID"/>
+        </w:rPr>
+        <w:t>release</w:t>
+      </w:r>
+      <w:proofErr w:type="spellEnd"/>
+    </w:p>
+    <w:p>
+      <w:pPr>
+        <w:pStyle w:val="ListParagraph"/>
+        <w:jc w:val="both"/>
+        <w:rPr>
+          <w:i/>
+          <w:iCs/>
+          <w:lang w:val="id-ID"/>
+        </w:rPr>
+      </w:pPr>
+      <w:r>
+        <w:rPr>
+          <w:i/>
+          <w:iCs/>
+          <w:lang w:val="id-ID"/>
+        </w:rPr>
+        <w:t>Tunggu sampai proses selesai. Hasilnya akan ada di folder </w:t>
+      </w:r>
+    </w:p>
+    <w:p>
+      <w:pPr>
+        <w:pStyle w:val="ListParagraph"/>
+        <w:jc w:val="both"/>
+        <w:rPr>
+          <w:lang w:val="id-ID"/>
+        </w:rPr>
+      </w:pPr>
+      <w:proofErr w:type="spellStart"/>
+      <w:r>
+        <w:rPr>
+          <w:i/>
+          <w:iCs/>
+          <w:lang w:val="id-ID"/>
+        </w:rPr>
+        <w:t>build</w:t>
+      </w:r>
+      <w:proofErr w:type="spellEnd"/>
+      <w:r>
+        <w:rPr>
+          <w:i/>
+          <w:iCs/>
+          <w:lang w:val="id-ID"/>
+        </w:rPr>
+        <w:t>/web</w:t>
+      </w:r>
+    </w:p>
+    <w:p>
+      <w:pPr>
+        <w:pStyle w:val="ListParagraph"/>
+        <w:jc w:val="both"/>
+        <w:rPr>
+          <w:lang w:val="id-ID"/>
+        </w:rPr>
+      </w:pPr>
+      <w:r>
+        <w:rPr>
+          <w:i/>
+          <w:iCs/>
+          <w:lang w:val="id-ID"/>
+        </w:rPr>
+        <w:t>.</w:t>
+      </w:r>
+    </w:p>
+    <w:p>
+      <w:pPr>
+        <w:pStyle w:val="ListParagraph"/>
+        <w:numPr>
+          <w:ilvl w:val="0"/>
+          <w:numId w:val="23"/>
+        </w:numPr>
+        <w:jc w:val="both"/>
+        <w:rPr>
+          <w:lang w:val="id-ID"/>
+        </w:rPr>
+      </w:pPr>
+      <w:proofErr w:type="spellStart"/>
+      <w:r>
+        <w:rPr>
+          <w:b/>
+          <w:bCs/>
+          <w:lang w:val="id-ID"/>
+        </w:rPr>
+        <w:t>Deploy</w:t>
+      </w:r>
+      <w:proofErr w:type="spellEnd"/>
+      <w:r>
+        <w:rPr>
+          <w:b/>
+          <w:bCs/>
+          <w:lang w:val="id-ID"/>
+        </w:rPr>
+        <w:t xml:space="preserve"> ke </w:t>
+      </w:r>
+      <w:proofErr w:type="spellStart"/>
+      <w:r>
+        <w:rPr>
+          <w:b/>
+          <w:bCs/>
+          <w:lang w:val="id-ID"/>
+        </w:rPr>
+        <w:t>Firebase</w:t>
+      </w:r>
+      <w:proofErr w:type="spellEnd"/>
+      <w:r>
+        <w:rPr>
+          <w:lang w:val="id-ID"/>
+        </w:rPr>
+        <w:t xml:space="preserve">: Jalankan perintah ini untuk mengunggah hasil </w:t>
+      </w:r>
+      <w:proofErr w:type="spellStart"/>
+      <w:r>
+        <w:rPr>
+          <w:lang w:val="id-ID"/>
+        </w:rPr>
+        <w:t>build</w:t>
+      </w:r>
+      <w:proofErr w:type="spellEnd"/>
+      <w:r>
+        <w:rPr>
+          <w:lang w:val="id-ID"/>
+        </w:rPr>
+        <w:t xml:space="preserve"> tadi ke </w:t>
+      </w:r>
+      <w:proofErr w:type="spellStart"/>
+      <w:r>
+        <w:rPr>
+          <w:lang w:val="id-ID"/>
+        </w:rPr>
+        <w:t>Firebase</w:t>
+      </w:r>
+      <w:proofErr w:type="spellEnd"/>
+      <w:r>
+        <w:rPr>
+          <w:lang w:val="id-ID"/>
+        </w:rPr>
+        <w:t xml:space="preserve"> </w:t>
+      </w:r>
+      <w:proofErr w:type="spellStart"/>
+      <w:r>
+        <w:rPr>
+          <w:lang w:val="id-ID"/>
+        </w:rPr>
+        <w:t>Hosting</w:t>
+      </w:r>
+      <w:proofErr w:type="spellEnd"/>
+      <w:r>
+        <w:rPr>
+          <w:lang w:val="id-ID"/>
+        </w:rPr>
+        <w:t>:</w:t>
+      </w:r>
+    </w:p>
+    <w:p>
+      <w:pPr>
+        <w:pStyle w:val="ListParagraph"/>
+        <w:jc w:val="both"/>
+        <w:rPr>
+          <w:lang w:val="id-ID"/>
+        </w:rPr>
+      </w:pPr>
+      <w:proofErr w:type="spellStart"/>
+      <w:r>
+        <w:rPr>
+          <w:lang w:val="id-ID"/>
+        </w:rPr>
+        <w:t>powershell</w:t>
+      </w:r>
+      <w:proofErr w:type="spellEnd"/>
+    </w:p>
+    <w:p>
+      <w:pPr>
+        <w:pStyle w:val="ListParagraph"/>
+        <w:jc w:val="both"/>
+        <w:rPr>
+          <w:lang w:val="id-ID"/>
+        </w:rPr>
+      </w:pPr>
+      <w:proofErr w:type="spellStart"/>
+      <w:r>
+        <w:rPr>
+          <w:lang w:val="id-ID"/>
+        </w:rPr>
+        <w:t>firebase</w:t>
+      </w:r>
+      <w:proofErr w:type="spellEnd"/>
+      <w:r>
+        <w:rPr>
+          <w:lang w:val="id-ID"/>
+        </w:rPr>
+        <w:t xml:space="preserve"> </w:t>
+      </w:r>
+      <w:proofErr w:type="spellStart"/>
+      <w:r>
+        <w:rPr>
+          <w:lang w:val="id-ID"/>
+        </w:rPr>
+        <w:t>deploy</w:t>
+      </w:r>
+      <w:proofErr w:type="spellEnd"/>
+      <w:r>
+        <w:rPr>
+          <w:lang w:val="id-ID"/>
+        </w:rPr>
+        <w:t xml:space="preserve"> --</w:t>
+      </w:r>
+      <w:proofErr w:type="spellStart"/>
+      <w:r>
+        <w:rPr>
+          <w:lang w:val="id-ID"/>
+        </w:rPr>
+        <w:t>only</w:t>
+      </w:r>
+      <w:proofErr w:type="spellEnd"/>
+      <w:r>
+        <w:rPr>
+          <w:lang w:val="id-ID"/>
+        </w:rPr>
+        <w:t xml:space="preserve"> </w:t>
+      </w:r>
+      <w:proofErr w:type="spellStart"/>
+      <w:r>
+        <w:rPr>
+          <w:lang w:val="id-ID"/>
+        </w:rPr>
+        <w:t>hosting</w:t>
+      </w:r>
+      <w:proofErr w:type="spellEnd"/>
+    </w:p>
+    <w:p>
+      <w:pPr>
+        <w:pStyle w:val="ListParagraph"/>
+        <w:numPr>
+          <w:ilvl w:val="0"/>
+          <w:numId w:val="23"/>
+        </w:numPr>
+        <w:jc w:val="both"/>
+        <w:rPr>
+          <w:lang w:val="id-ID"/>
+        </w:rPr>
+      </w:pPr>
+      <w:r>
+        <w:rPr>
+          <w:b/>
+          <w:bCs/>
+          <w:lang w:val="id-ID"/>
+        </w:rPr>
+        <w:t>Selesai!</w:t>
+      </w:r>
+      <w:r>
+        <w:rPr>
+          <w:lang w:val="id-ID"/>
+        </w:rPr>
+        <w:t>: Aplikasi Anda akan dapat diakses di: </w:t>
+      </w:r>
+      <w:hyperlink r:id="rId5" w:history="1">
+        <w:r>
+          <w:rPr>
+            <w:rStyle w:val="Hyperlink"/>
+            <w:lang w:val="id-ID"/>
+          </w:rPr>
+          <w:t>https://lfkitchen-app-5070f.web.app</w:t>
+        </w:r>
+      </w:hyperlink>
+    </w:p>
+    <w:p>
+      <w:pPr>
+        <w:pStyle w:val="ListParagraph"/>
+        <w:jc w:val="both"/>
+        <w:rPr>
+          <w:lang w:val="id-ID"/>
+        </w:rPr>
+      </w:pPr>
+      <w:r>
+        <w:rPr>
+          <w:lang w:val="id-ID"/>
+        </w:rPr>
+        <w:pict w14:anchorId="185AADD3">
+          <v:rect id="_x0000_i1035" style="width:0;height:0" o:hralign="center" o:hrstd="t" o:hr="t" fillcolor="#a0a0a0" stroked="f"/>
+        </w:pict>
+      </w:r>
+    </w:p>
+    <w:p>
+      <w:pPr>
+        <w:pStyle w:val="ListParagraph"/>
+        <w:jc w:val="both"/>
+        <w:rPr>
+          <w:b/>
+          <w:bCs/>
+          <w:lang w:val="id-ID"/>
+        </w:rPr>
+      </w:pPr>
+      <w:proofErr w:type="spellStart"/>
+      <w:r>
+        <w:rPr>
+          <w:b/>
+          <w:bCs/>
+          <w:lang w:val="id-ID"/>
+        </w:rPr>
+        <w:t>Tips</w:t>
+      </w:r>
+      <w:proofErr w:type="spellEnd"/>
+      <w:r>
+        <w:rPr>
+          <w:b/>
+          <w:bCs/>
+          <w:lang w:val="id-ID"/>
+        </w:rPr>
+        <w:t>:</w:t>
+      </w:r>
+    </w:p>
+    <w:p>
+      <w:pPr>
+        <w:pStyle w:val="ListParagraph"/>
+        <w:numPr>
+          <w:ilvl w:val="0"/>
+          <w:numId w:val="24"/>
+        </w:numPr>
+        <w:jc w:val="both"/>
+        <w:rPr>
+          <w:lang w:val="id-ID"/>
+        </w:rPr>
+      </w:pPr>
+      <w:r>
+        <w:rPr>
+          <w:lang w:val="id-ID"/>
+        </w:rPr>
+        <w:t xml:space="preserve">Pastikan Anda sudah </w:t>
+      </w:r>
+      <w:proofErr w:type="spellStart"/>
+      <w:r>
+        <w:rPr>
+          <w:lang w:val="id-ID"/>
+        </w:rPr>
+        <w:t>login</w:t>
+      </w:r>
+      <w:proofErr w:type="spellEnd"/>
+      <w:r>
+        <w:rPr>
+          <w:lang w:val="id-ID"/>
+        </w:rPr>
+        <w:t xml:space="preserve"> ke </w:t>
+      </w:r>
+      <w:proofErr w:type="spellStart"/>
+      <w:r>
+        <w:rPr>
+          <w:lang w:val="id-ID"/>
+        </w:rPr>
+        <w:t>Firebase</w:t>
+      </w:r>
+      <w:proofErr w:type="spellEnd"/>
+      <w:r>
+        <w:rPr>
+          <w:lang w:val="id-ID"/>
+        </w:rPr>
+        <w:t xml:space="preserve"> di komputer ini (</w:t>
+      </w:r>
+    </w:p>
+    <w:p>
+      <w:pPr>
+        <w:pStyle w:val="ListParagraph"/>
+        <w:jc w:val="both"/>
+        <w:rPr>
+          <w:lang w:val="id-ID"/>
+        </w:rPr>
+      </w:pPr>
+      <w:proofErr w:type="spellStart"/>
+      <w:r>
+        <w:rPr>
+          <w:lang w:val="id-ID"/>
+        </w:rPr>
+        <w:t>firebase</w:t>
+      </w:r>
+      <w:proofErr w:type="spellEnd"/>
+      <w:r>
+        <w:rPr>
+          <w:lang w:val="id-ID"/>
+        </w:rPr>
+        <w:t xml:space="preserve"> </w:t>
+      </w:r>
+      <w:proofErr w:type="spellStart"/>
+      <w:r>
+        <w:rPr>
+          <w:lang w:val="id-ID"/>
+        </w:rPr>
+        <w:t>login</w:t>
+      </w:r>
+      <w:proofErr w:type="spellEnd"/>
+    </w:p>
+    <w:p>
+      <w:pPr>
+        <w:pStyle w:val="ListParagraph"/>
+        <w:jc w:val="both"/>
+        <w:rPr>
+          <w:lang w:val="id-ID"/>
+        </w:rPr>
+      </w:pPr>
+      <w:r>
+        <w:rPr>
+          <w:lang w:val="id-ID"/>
+        </w:rPr>
+        <w:t>).</w:t>
+      </w:r>
+    </w:p>
+    <w:p>
+      <w:pPr>
+        <w:pStyle w:val="ListParagraph"/>
+        <w:numPr>
+          <w:ilvl w:val="0"/>
+          <w:numId w:val="24"/>
+        </w:numPr>
+        <w:jc w:val="both"/>
+        <w:rPr>
+          <w:lang w:val="id-ID"/>
+        </w:rPr>
+      </w:pPr>
+      <w:r>
+        <w:rPr>
+          <w:lang w:val="id-ID"/>
+        </w:rPr>
+        <w:t xml:space="preserve">Jika Anda ingin saya yang menjalankan proses </w:t>
+      </w:r>
+      <w:proofErr w:type="spellStart"/>
+      <w:r>
+        <w:rPr>
+          <w:lang w:val="id-ID"/>
+        </w:rPr>
+        <w:t>build</w:t>
+      </w:r>
+      <w:proofErr w:type="spellEnd"/>
+      <w:r>
+        <w:rPr>
+          <w:lang w:val="id-ID"/>
+        </w:rPr>
+        <w:t xml:space="preserve"> (karena butuh waktu beberapa menit), ketik </w:t>
+      </w:r>
+    </w:p>
+    <w:p>
+      <w:pPr>
+        <w:pStyle w:val="ListParagraph"/>
+        <w:jc w:val="both"/>
+        <w:rPr>
+          <w:lang w:val="id-ID"/>
+        </w:rPr>
+      </w:pPr>
+      <w:r>
+        <w:rPr>
+          <w:lang w:val="id-ID"/>
+        </w:rPr>
+        <w:t>/</w:t>
+      </w:r>
+      <w:proofErr w:type="spellStart"/>
+      <w:r>
+        <w:rPr>
+          <w:lang w:val="id-ID"/>
+        </w:rPr>
+        <w:t>deploy</w:t>
+      </w:r>
+      <w:proofErr w:type="spellEnd"/>
+    </w:p>
+    <w:p>
+      <w:pPr>
+        <w:pStyle w:val="ListParagraph"/>
+        <w:jc w:val="both"/>
+        <w:rPr>
+          <w:lang w:val="id-ID"/>
+        </w:rPr>
+      </w:pPr>
+      <w:r>
+        <w:rPr>
+          <w:lang w:val="id-ID"/>
+        </w:rPr>
+        <w:t>. Namun, Anda tetap perlu menjalankan </w:t>
+      </w:r>
+    </w:p>
+    <w:p>
+      <w:pPr>
+        <w:pStyle w:val="ListParagraph"/>
+        <w:jc w:val="both"/>
+        <w:rPr>
+          <w:lang w:val="id-ID"/>
+        </w:rPr>
+      </w:pPr>
+      <w:proofErr w:type="spellStart"/>
+      <w:r>
+        <w:rPr>
+          <w:lang w:val="id-ID"/>
+        </w:rPr>
+        <w:t>firebase</w:t>
+      </w:r>
+      <w:proofErr w:type="spellEnd"/>
+      <w:r>
+        <w:rPr>
+          <w:lang w:val="id-ID"/>
+        </w:rPr>
+        <w:t xml:space="preserve"> </w:t>
+      </w:r>
+      <w:proofErr w:type="spellStart"/>
+      <w:r>
+        <w:rPr>
+          <w:lang w:val="id-ID"/>
+        </w:rPr>
+        <w:t>deploy</w:t>
+      </w:r>
+      <w:proofErr w:type="spellEnd"/>
+    </w:p>
+    <w:p>
+      <w:pPr>
+        <w:pStyle w:val="ListParagraph"/>
+        <w:jc w:val="both"/>
+        <w:rPr>
+          <w:lang w:val="id-ID"/>
+        </w:rPr>
+      </w:pPr>
+      <w:r>
+        <w:rPr>
+          <w:lang w:val="id-ID"/>
+        </w:rPr>
+        <w:t xml:space="preserve"> sendiri jika saya tidak memiliki akses </w:t>
+      </w:r>
+      <w:proofErr w:type="spellStart"/>
+      <w:r>
+        <w:rPr>
+          <w:lang w:val="id-ID"/>
+        </w:rPr>
+        <w:t>login</w:t>
+      </w:r>
+      <w:proofErr w:type="spellEnd"/>
+      <w:r>
+        <w:rPr>
+          <w:lang w:val="id-ID"/>
+        </w:rPr>
+        <w:t xml:space="preserve"> ke akun </w:t>
+      </w:r>
+      <w:proofErr w:type="spellStart"/>
+      <w:r>
+        <w:rPr>
+          <w:lang w:val="id-ID"/>
+        </w:rPr>
+        <w:t>Firebase</w:t>
+      </w:r>
+      <w:proofErr w:type="spellEnd"/>
+      <w:r>
+        <w:rPr>
+          <w:lang w:val="id-ID"/>
+        </w:rPr>
+        <w:t xml:space="preserve"> Anda.</w:t>
+      </w:r>
+    </w:p>
+    <w:p>
+      <w:pPr>
+        <w:pStyle w:val="ListParagraph"/>
+        <w:jc w:val="both"/>
+        <w:rPr>
+          <w:lang w:val="id-ID"/>
+        </w:rPr>
+      </w:pPr>
+      <w:r>
+        <w:rPr>
+          <w:lang w:val="id-ID"/>
+        </w:rPr>
+        <w:t>Apakah Anda ingin saya bantu jalankan proses </w:t>
+      </w:r>
+      <w:proofErr w:type="spellStart"/>
+      <w:r>
+        <w:rPr>
+          <w:b/>
+          <w:bCs/>
+          <w:lang w:val="id-ID"/>
+        </w:rPr>
+        <w:t>Build</w:t>
+      </w:r>
+      <w:proofErr w:type="spellEnd"/>
+      <w:r>
+        <w:rPr>
+          <w:b/>
+          <w:bCs/>
+          <w:lang w:val="id-ID"/>
+        </w:rPr>
+        <w:t xml:space="preserve"> </w:t>
+      </w:r>
+      <w:proofErr w:type="spellStart"/>
+      <w:r>
+        <w:rPr>
+          <w:b/>
+          <w:bCs/>
+          <w:lang w:val="id-ID"/>
+        </w:rPr>
+        <w:t>Web</w:t>
+      </w:r>
+      <w:r>
+        <w:rPr>
+          <w:lang w:val="id-ID"/>
+        </w:rPr>
+        <w:t>-nya</w:t>
+      </w:r>
+      <w:proofErr w:type="spellEnd"/>
+      <w:r>
+        <w:rPr>
+          <w:lang w:val="id-ID"/>
+        </w:rPr>
+        <w:t xml:space="preserve"> sekarang?</w:t>
+      </w:r>
+    </w:p>
+    <w:p>
+      <w:pPr>
+        <w:pStyle w:val="ListParagraph"/>
+        <w:jc w:val="both"/>
+        <w:rPr>
+          <w:lang w:val="id-ID"/>
+        </w:rPr>
+      </w:pPr>
+      <w:r>
+        <w:rPr>
+          <w:lang w:val="id-ID"/>
+        </w:rPr>
+        <w:t>deploy.md</w:t>
+      </w:r>
+    </w:p>
+    <w:p>
+      <w:pPr>
+        <w:pStyle w:val="ListParagraph"/>
+        <w:jc w:val="both"/>
+        <w:rPr>
+          <w:lang w:val="id-ID"/>
+        </w:rPr>
+      </w:pPr>
+      <w:r>
+        <w:rPr>
+          <w:lang w:val="id-ID"/>
+        </w:rPr>
+        <w:t>Open</w:t>
+      </w:r>
+    </w:p>
+    <w:p>
+      <w:pPr>
+        <w:pStyle w:val="ListParagraph"/>
+        <w:jc w:val="both"/>
+        <w:rPr>
+          <w:lang w:val="sv-SE"/>
+        </w:rPr>
+      </w:pPr>
+    </w:p>
     <w:sectPr>
       <w:pgSz w:w="12240" w:h="15840"/>
       <w:pgMar w:top="1440" w:right="1440" w:bottom="1440" w:left="1440" w:header="708" w:footer="708" w:gutter="0"/>
@@ -6020,6 +7015,155 @@
     </w:lvl>
   </w:abstractNum>
   <w:abstractNum w:abstractNumId="4" w15:restartNumberingAfterBreak="0">
+    <w:nsid w:val="18813C0E"/>
+    <w:multiLevelType w:val="multilevel"/>
+    <w:tmpl w:val="6C5694A2"/>
+    <w:lvl w:ilvl="0">
+      <w:start w:val="1"/>
+      <w:numFmt w:val="bullet"/>
+      <w:lvlText w:val=""/>
+      <w:lvlJc w:val="left"/>
+      <w:pPr>
+        <w:tabs>
+          <w:tab w:val="num" w:pos="720"/>
+        </w:tabs>
+        <w:ind w:left="720" w:hanging="360"/>
+      </w:pPr>
+      <w:rPr>
+        <w:rFonts w:ascii="Symbol" w:hAnsi="Symbol" w:hint="default"/>
+        <w:sz w:val="20"/>
+      </w:rPr>
+    </w:lvl>
+    <w:lvl w:ilvl="1" w:tentative="1">
+      <w:start w:val="1"/>
+      <w:numFmt w:val="bullet"/>
+      <w:lvlText w:val=""/>
+      <w:lvlJc w:val="left"/>
+      <w:pPr>
+        <w:tabs>
+          <w:tab w:val="num" w:pos="1440"/>
+        </w:tabs>
+        <w:ind w:left="1440" w:hanging="360"/>
+      </w:pPr>
+      <w:rPr>
+        <w:rFonts w:ascii="Symbol" w:hAnsi="Symbol" w:hint="default"/>
+        <w:sz w:val="20"/>
+      </w:rPr>
+    </w:lvl>
+    <w:lvl w:ilvl="2" w:tentative="1">
+      <w:start w:val="1"/>
+      <w:numFmt w:val="bullet"/>
+      <w:lvlText w:val=""/>
+      <w:lvlJc w:val="left"/>
+      <w:pPr>
+        <w:tabs>
+          <w:tab w:val="num" w:pos="2160"/>
+        </w:tabs>
+        <w:ind w:left="2160" w:hanging="360"/>
+      </w:pPr>
+      <w:rPr>
+        <w:rFonts w:ascii="Symbol" w:hAnsi="Symbol" w:hint="default"/>
+        <w:sz w:val="20"/>
+      </w:rPr>
+    </w:lvl>
+    <w:lvl w:ilvl="3" w:tentative="1">
+      <w:start w:val="1"/>
+      <w:numFmt w:val="bullet"/>
+      <w:lvlText w:val=""/>
+      <w:lvlJc w:val="left"/>
+      <w:pPr>
+        <w:tabs>
+          <w:tab w:val="num" w:pos="2880"/>
+        </w:tabs>
+        <w:ind w:left="2880" w:hanging="360"/>
+      </w:pPr>
+      <w:rPr>
+        <w:rFonts w:ascii="Symbol" w:hAnsi="Symbol" w:hint="default"/>
+        <w:sz w:val="20"/>
+      </w:rPr>
+    </w:lvl>
+    <w:lvl w:ilvl="4" w:tentative="1">
+      <w:start w:val="1"/>
+      <w:numFmt w:val="bullet"/>
+      <w:lvlText w:val=""/>
+      <w:lvlJc w:val="left"/>
+      <w:pPr>
+        <w:tabs>
+          <w:tab w:val="num" w:pos="3600"/>
+        </w:tabs>
+        <w:ind w:left="3600" w:hanging="360"/>
+      </w:pPr>
+      <w:rPr>
+        <w:rFonts w:ascii="Symbol" w:hAnsi="Symbol" w:hint="default"/>
+        <w:sz w:val="20"/>
+      </w:rPr>
+    </w:lvl>
+    <w:lvl w:ilvl="5" w:tentative="1">
+      <w:start w:val="1"/>
+      <w:numFmt w:val="bullet"/>
+      <w:lvlText w:val=""/>
+      <w:lvlJc w:val="left"/>
+      <w:pPr>
+        <w:tabs>
+          <w:tab w:val="num" w:pos="4320"/>
+        </w:tabs>
+        <w:ind w:left="4320" w:hanging="360"/>
+      </w:pPr>
+      <w:rPr>
+        <w:rFonts w:ascii="Symbol" w:hAnsi="Symbol" w:hint="default"/>
+        <w:sz w:val="20"/>
+      </w:rPr>
+    </w:lvl>
+    <w:lvl w:ilvl="6" w:tentative="1">
+      <w:start w:val="1"/>
+      <w:numFmt w:val="bullet"/>
+      <w:lvlText w:val=""/>
+      <w:lvlJc w:val="left"/>
+      <w:pPr>
+        <w:tabs>
+          <w:tab w:val="num" w:pos="5040"/>
+        </w:tabs>
+        <w:ind w:left="5040" w:hanging="360"/>
+      </w:pPr>
+      <w:rPr>
+        <w:rFonts w:ascii="Symbol" w:hAnsi="Symbol" w:hint="default"/>
+        <w:sz w:val="20"/>
+      </w:rPr>
+    </w:lvl>
+    <w:lvl w:ilvl="7" w:tentative="1">
+      <w:start w:val="1"/>
+      <w:numFmt w:val="bullet"/>
+      <w:lvlText w:val=""/>
+      <w:lvlJc w:val="left"/>
+      <w:pPr>
+        <w:tabs>
+          <w:tab w:val="num" w:pos="5760"/>
+        </w:tabs>
+        <w:ind w:left="5760" w:hanging="360"/>
+      </w:pPr>
+      <w:rPr>
+        <w:rFonts w:ascii="Symbol" w:hAnsi="Symbol" w:hint="default"/>
+        <w:sz w:val="20"/>
+      </w:rPr>
+    </w:lvl>
+    <w:lvl w:ilvl="8" w:tentative="1">
+      <w:start w:val="1"/>
+      <w:numFmt w:val="bullet"/>
+      <w:lvlText w:val=""/>
+      <w:lvlJc w:val="left"/>
+      <w:pPr>
+        <w:tabs>
+          <w:tab w:val="num" w:pos="6480"/>
+        </w:tabs>
+        <w:ind w:left="6480" w:hanging="360"/>
+      </w:pPr>
+      <w:rPr>
+        <w:rFonts w:ascii="Symbol" w:hAnsi="Symbol" w:hint="default"/>
+        <w:sz w:val="20"/>
+      </w:rPr>
+    </w:lvl>
+  </w:abstractNum>
+  <w:abstractNum w:abstractNumId="5" w15:restartNumberingAfterBreak="0">
     <w:nsid w:val="20411CFD"/>
     <w:multiLevelType w:val="multilevel"/>
     <w:tmpl w:val="A3883692"/>
@@ -6168,7 +7312,7 @@
       </w:rPr>
     </w:lvl>
   </w:abstractNum>
-  <w:abstractNum w:abstractNumId="5" w15:restartNumberingAfterBreak="0">
+  <w:abstractNum w:abstractNumId="6" w15:restartNumberingAfterBreak="0">
     <w:nsid w:val="21C95C6E"/>
     <w:multiLevelType w:val="multilevel"/>
     <w:tmpl w:val="66EAB612"/>
@@ -6281,7 +7425,7 @@
       </w:pPr>
     </w:lvl>
   </w:abstractNum>
-  <w:abstractNum w:abstractNumId="6" w15:restartNumberingAfterBreak="0">
+  <w:abstractNum w:abstractNumId="7" w15:restartNumberingAfterBreak="0">
     <w:nsid w:val="27192B8D"/>
     <w:multiLevelType w:val="multilevel"/>
     <w:tmpl w:val="D4184884"/>
@@ -6430,7 +7574,7 @@
       </w:rPr>
     </w:lvl>
   </w:abstractNum>
-  <w:abstractNum w:abstractNumId="7" w15:restartNumberingAfterBreak="0">
+  <w:abstractNum w:abstractNumId="8" w15:restartNumberingAfterBreak="0">
     <w:nsid w:val="2C4172E3"/>
     <w:multiLevelType w:val="multilevel"/>
     <w:tmpl w:val="871E3134"/>
@@ -6579,7 +7723,120 @@
       </w:rPr>
     </w:lvl>
   </w:abstractNum>
-  <w:abstractNum w:abstractNumId="8" w15:restartNumberingAfterBreak="0">
+  <w:abstractNum w:abstractNumId="9" w15:restartNumberingAfterBreak="0">
+    <w:nsid w:val="2D973478"/>
+    <w:multiLevelType w:val="multilevel"/>
+    <w:tmpl w:val="5726B268"/>
+    <w:lvl w:ilvl="0">
+      <w:start w:val="1"/>
+      <w:numFmt w:val="decimal"/>
+      <w:lvlText w:val="%1."/>
+      <w:lvlJc w:val="left"/>
+      <w:pPr>
+        <w:tabs>
+          <w:tab w:val="num" w:pos="720"/>
+        </w:tabs>
+        <w:ind w:left="720" w:hanging="360"/>
+      </w:pPr>
+    </w:lvl>
+    <w:lvl w:ilvl="1" w:tentative="1">
+      <w:start w:val="1"/>
+      <w:numFmt w:val="decimal"/>
+      <w:lvlText w:val="%2."/>
+      <w:lvlJc w:val="left"/>
+      <w:pPr>
+        <w:tabs>
+          <w:tab w:val="num" w:pos="1440"/>
+        </w:tabs>
+        <w:ind w:left="1440" w:hanging="360"/>
+      </w:pPr>
+    </w:lvl>
+    <w:lvl w:ilvl="2" w:tentative="1">
+      <w:start w:val="1"/>
+      <w:numFmt w:val="decimal"/>
+      <w:lvlText w:val="%3."/>
+      <w:lvlJc w:val="left"/>
+      <w:pPr>
+        <w:tabs>
+          <w:tab w:val="num" w:pos="2160"/>
+        </w:tabs>
+        <w:ind w:left="2160" w:hanging="360"/>
+      </w:pPr>
+    </w:lvl>
+    <w:lvl w:ilvl="3" w:tentative="1">
+      <w:start w:val="1"/>
+      <w:numFmt w:val="decimal"/>
+      <w:lvlText w:val="%4."/>
+      <w:lvlJc w:val="left"/>
+      <w:pPr>
+        <w:tabs>
+          <w:tab w:val="num" w:pos="2880"/>
+        </w:tabs>
+        <w:ind w:left="2880" w:hanging="360"/>
+      </w:pPr>
+    </w:lvl>
+    <w:lvl w:ilvl="4" w:tentative="1">
+      <w:start w:val="1"/>
+      <w:numFmt w:val="decimal"/>
+      <w:lvlText w:val="%5."/>
+      <w:lvlJc w:val="left"/>
+      <w:pPr>
+        <w:tabs>
+          <w:tab w:val="num" w:pos="3600"/>
+        </w:tabs>
+        <w:ind w:left="3600" w:hanging="360"/>
+      </w:pPr>
+    </w:lvl>
+    <w:lvl w:ilvl="5" w:tentative="1">
+      <w:start w:val="1"/>
+      <w:numFmt w:val="decimal"/>
+      <w:lvlText w:val="%6."/>
+      <w:lvlJc w:val="left"/>
+      <w:pPr>
+        <w:tabs>
+          <w:tab w:val="num" w:pos="4320"/>
+        </w:tabs>
+        <w:ind w:left="4320" w:hanging="360"/>
+      </w:pPr>
+    </w:lvl>
+    <w:lvl w:ilvl="6" w:tentative="1">
+      <w:start w:val="1"/>
+      <w:numFmt w:val="decimal"/>
+      <w:lvlText w:val="%7."/>
+      <w:lvlJc w:val="left"/>
+      <w:pPr>
+        <w:tabs>
+          <w:tab w:val="num" w:pos="5040"/>
+        </w:tabs>
+        <w:ind w:left="5040" w:hanging="360"/>
+      </w:pPr>
+    </w:lvl>
+    <w:lvl w:ilvl="7" w:tentative="1">
+      <w:start w:val="1"/>
+      <w:numFmt w:val="decimal"/>
+      <w:lvlText w:val="%8."/>
+      <w:lvlJc w:val="left"/>
+      <w:pPr>
+        <w:tabs>
+          <w:tab w:val="num" w:pos="5760"/>
+        </w:tabs>
+        <w:ind w:left="5760" w:hanging="360"/>
+      </w:pPr>
+    </w:lvl>
+    <w:lvl w:ilvl="8" w:tentative="1">
+      <w:start w:val="1"/>
+      <w:numFmt w:val="decimal"/>
+      <w:lvlText w:val="%9."/>
+      <w:lvlJc w:val="left"/>
+      <w:pPr>
+        <w:tabs>
+          <w:tab w:val="num" w:pos="6480"/>
+        </w:tabs>
+        <w:ind w:left="6480" w:hanging="360"/>
+      </w:pPr>
+    </w:lvl>
+  </w:abstractNum>
+  <w:abstractNum w:abstractNumId="10" w15:restartNumberingAfterBreak="0">
     <w:nsid w:val="2E3D04E7"/>
     <w:multiLevelType w:val="multilevel"/>
     <w:tmpl w:val="64DE1ED2"/>
@@ -6728,7 +7985,7 @@
       </w:rPr>
     </w:lvl>
   </w:abstractNum>
-  <w:abstractNum w:abstractNumId="9" w15:restartNumberingAfterBreak="0">
+  <w:abstractNum w:abstractNumId="11" w15:restartNumberingAfterBreak="0">
     <w:nsid w:val="312E6979"/>
     <w:multiLevelType w:val="multilevel"/>
     <w:tmpl w:val="1298932E"/>
@@ -6877,7 +8134,7 @@
       </w:rPr>
     </w:lvl>
   </w:abstractNum>
-  <w:abstractNum w:abstractNumId="10" w15:restartNumberingAfterBreak="0">
+  <w:abstractNum w:abstractNumId="12" w15:restartNumberingAfterBreak="0">
     <w:nsid w:val="376C781B"/>
     <w:multiLevelType w:val="multilevel"/>
     <w:tmpl w:val="E39A0D86"/>
@@ -7022,7 +8279,7 @@
       </w:rPr>
     </w:lvl>
   </w:abstractNum>
-  <w:abstractNum w:abstractNumId="11" w15:restartNumberingAfterBreak="0">
+  <w:abstractNum w:abstractNumId="13" w15:restartNumberingAfterBreak="0">
     <w:nsid w:val="3AB329F9"/>
     <w:multiLevelType w:val="multilevel"/>
     <w:tmpl w:val="C31EE5D2"/>
@@ -7171,7 +8428,7 @@
       </w:rPr>
     </w:lvl>
   </w:abstractNum>
-  <w:abstractNum w:abstractNumId="12" w15:restartNumberingAfterBreak="0">
+  <w:abstractNum w:abstractNumId="14" w15:restartNumberingAfterBreak="0">
     <w:nsid w:val="3D355408"/>
     <w:multiLevelType w:val="multilevel"/>
     <w:tmpl w:val="137CD2A8"/>
@@ -7284,7 +8541,7 @@
       </w:pPr>
     </w:lvl>
   </w:abstractNum>
-  <w:abstractNum w:abstractNumId="13" w15:restartNumberingAfterBreak="0">
+  <w:abstractNum w:abstractNumId="15" w15:restartNumberingAfterBreak="0">
     <w:nsid w:val="48CD1CDA"/>
     <w:multiLevelType w:val="multilevel"/>
     <w:tmpl w:val="38323F1E"/>
@@ -7397,7 +8654,7 @@
       </w:pPr>
     </w:lvl>
   </w:abstractNum>
-  <w:abstractNum w:abstractNumId="14" w15:restartNumberingAfterBreak="0">
+  <w:abstractNum w:abstractNumId="16" w15:restartNumberingAfterBreak="0">
     <w:nsid w:val="51FF5A1F"/>
     <w:multiLevelType w:val="multilevel"/>
     <w:tmpl w:val="34B0BC20"/>
@@ -7546,7 +8803,7 @@
       </w:rPr>
     </w:lvl>
   </w:abstractNum>
-  <w:abstractNum w:abstractNumId="15" w15:restartNumberingAfterBreak="0">
+  <w:abstractNum w:abstractNumId="17" w15:restartNumberingAfterBreak="0">
     <w:nsid w:val="52474397"/>
     <w:multiLevelType w:val="multilevel"/>
     <w:tmpl w:val="5B184138"/>
@@ -7695,7 +8952,7 @@
       </w:rPr>
     </w:lvl>
   </w:abstractNum>
-  <w:abstractNum w:abstractNumId="16" w15:restartNumberingAfterBreak="0">
+  <w:abstractNum w:abstractNumId="18" w15:restartNumberingAfterBreak="0">
     <w:nsid w:val="59C17A9D"/>
     <w:multiLevelType w:val="multilevel"/>
     <w:tmpl w:val="46DE16B6"/>
@@ -7840,7 +9097,7 @@
       </w:rPr>
     </w:lvl>
   </w:abstractNum>
-  <w:abstractNum w:abstractNumId="17" w15:restartNumberingAfterBreak="0">
+  <w:abstractNum w:abstractNumId="19" w15:restartNumberingAfterBreak="0">
     <w:nsid w:val="61F00A0C"/>
     <w:multiLevelType w:val="multilevel"/>
     <w:tmpl w:val="45264554"/>
@@ -7989,7 +9246,7 @@
       </w:rPr>
     </w:lvl>
   </w:abstractNum>
-  <w:abstractNum w:abstractNumId="18" w15:restartNumberingAfterBreak="0">
+  <w:abstractNum w:abstractNumId="20" w15:restartNumberingAfterBreak="0">
     <w:nsid w:val="62F06290"/>
     <w:multiLevelType w:val="multilevel"/>
     <w:tmpl w:val="03BEE264"/>
@@ -8138,7 +9395,7 @@
       </w:rPr>
     </w:lvl>
   </w:abstractNum>
-  <w:abstractNum w:abstractNumId="19" w15:restartNumberingAfterBreak="0">
+  <w:abstractNum w:abstractNumId="21" w15:restartNumberingAfterBreak="0">
     <w:nsid w:val="6B3E664E"/>
     <w:multiLevelType w:val="multilevel"/>
     <w:tmpl w:val="FBAC9EF0"/>
@@ -8287,7 +9544,7 @@
       </w:rPr>
     </w:lvl>
   </w:abstractNum>
-  <w:abstractNum w:abstractNumId="20" w15:restartNumberingAfterBreak="0">
+  <w:abstractNum w:abstractNumId="22" w15:restartNumberingAfterBreak="0">
     <w:nsid w:val="6BEF0056"/>
     <w:multiLevelType w:val="multilevel"/>
     <w:tmpl w:val="23FA9DD8"/>
@@ -8436,7 +9693,7 @@
       </w:rPr>
     </w:lvl>
   </w:abstractNum>
-  <w:abstractNum w:abstractNumId="21" w15:restartNumberingAfterBreak="0">
+  <w:abstractNum w:abstractNumId="23" w15:restartNumberingAfterBreak="0">
     <w:nsid w:val="7FBA56C5"/>
     <w:multiLevelType w:val="hybridMultilevel"/>
     <w:tmpl w:val="4420003C"/>
@@ -8552,67 +9809,73 @@
     <w:abstractNumId w:val="2"/>
   </w:num>
   <w:num w:numId="2" w16cid:durableId="2136100090">
-    <w:abstractNumId w:val="21"/>
+    <w:abstractNumId w:val="23"/>
   </w:num>
   <w:num w:numId="3" w16cid:durableId="37559716">
-    <w:abstractNumId w:val="20"/>
+    <w:abstractNumId w:val="22"/>
   </w:num>
   <w:num w:numId="4" w16cid:durableId="683096160">
-    <w:abstractNumId w:val="15"/>
+    <w:abstractNumId w:val="17"/>
   </w:num>
   <w:num w:numId="5" w16cid:durableId="1632706476">
     <w:abstractNumId w:val="0"/>
   </w:num>
   <w:num w:numId="6" w16cid:durableId="1594167444">
-    <w:abstractNumId w:val="9"/>
+    <w:abstractNumId w:val="11"/>
   </w:num>
   <w:num w:numId="7" w16cid:durableId="609822212">
-    <w:abstractNumId w:val="11"/>
+    <w:abstractNumId w:val="13"/>
   </w:num>
   <w:num w:numId="8" w16cid:durableId="722024025">
-    <w:abstractNumId w:val="6"/>
+    <w:abstractNumId w:val="7"/>
   </w:num>
   <w:num w:numId="9" w16cid:durableId="313533272">
-    <w:abstractNumId w:val="12"/>
+    <w:abstractNumId w:val="14"/>
   </w:num>
   <w:num w:numId="10" w16cid:durableId="1029180900">
-    <w:abstractNumId w:val="5"/>
+    <w:abstractNumId w:val="6"/>
   </w:num>
   <w:num w:numId="11" w16cid:durableId="1900431970">
     <w:abstractNumId w:val="1"/>
   </w:num>
   <w:num w:numId="12" w16cid:durableId="1535730463">
-    <w:abstractNumId w:val="13"/>
+    <w:abstractNumId w:val="15"/>
   </w:num>
   <w:num w:numId="13" w16cid:durableId="53890764">
-    <w:abstractNumId w:val="17"/>
+    <w:abstractNumId w:val="19"/>
   </w:num>
   <w:num w:numId="14" w16cid:durableId="1672828420">
-    <w:abstractNumId w:val="4"/>
+    <w:abstractNumId w:val="5"/>
   </w:num>
   <w:num w:numId="15" w16cid:durableId="2131707077">
-    <w:abstractNumId w:val="7"/>
+    <w:abstractNumId w:val="8"/>
   </w:num>
   <w:num w:numId="16" w16cid:durableId="1618025738">
-    <w:abstractNumId w:val="14"/>
+    <w:abstractNumId w:val="16"/>
   </w:num>
   <w:num w:numId="17" w16cid:durableId="1739744498">
-    <w:abstractNumId w:val="8"/>
+    <w:abstractNumId w:val="10"/>
   </w:num>
   <w:num w:numId="18" w16cid:durableId="1452942350">
-    <w:abstractNumId w:val="16"/>
+    <w:abstractNumId w:val="18"/>
   </w:num>
   <w:num w:numId="19" w16cid:durableId="1721786642">
-    <w:abstractNumId w:val="19"/>
+    <w:abstractNumId w:val="21"/>
   </w:num>
   <w:num w:numId="20" w16cid:durableId="152575981">
-    <w:abstractNumId w:val="10"/>
+    <w:abstractNumId w:val="12"/>
   </w:num>
   <w:num w:numId="21" w16cid:durableId="87818702">
     <w:abstractNumId w:val="3"/>
   </w:num>
   <w:num w:numId="22" w16cid:durableId="1351377315">
-    <w:abstractNumId w:val="18"/>
+    <w:abstractNumId w:val="20"/>
+  </w:num>
+  <w:num w:numId="23" w16cid:durableId="2019698580">
+    <w:abstractNumId w:val="9"/>
+  </w:num>
+  <w:num w:numId="24" w16cid:durableId="1331174985">
+    <w:abstractNumId w:val="4"/>
   </w:num>
 </w:numbering>
 </file>
@@ -9533,6 +10796,29 @@
       <w:spacing w:val="5"/>
     </w:rPr>
   </w:style>
+  <w:style w:type="character" w:styleId="Hyperlink">
+    <w:name w:val="Hyperlink"/>
+    <w:basedOn w:val="DefaultParagraphFont"/>
+    <w:uiPriority w:val="99"/>
+    <w:unhideWhenUsed/>
+    <w:rsid w:val="00B779B4"/>
+    <w:rPr>
+      <w:color w:val="0563C1" w:themeColor="hyperlink"/>
+      <w:u w:val="single"/>
+    </w:rPr>
+  </w:style>
+  <w:style w:type="character" w:styleId="UnresolvedMention">
+    <w:name w:val="Unresolved Mention"/>
+    <w:basedOn w:val="DefaultParagraphFont"/>
+    <w:uiPriority w:val="99"/>
+    <w:semiHidden/>
+    <w:unhideWhenUsed/>
+    <w:rsid w:val="00B779B4"/>
+    <w:rPr>
+      <w:color w:val="605E5C"/>
+      <w:shd w:val="clear" w:color="auto" w:fill="E1DFDD"/>
+    </w:rPr>
+  </w:style>
 </w:styles>
 </file>
 

</xml_diff>